<commit_message>
Refactor status terminology from 'rejected' to 'disapproved' across the application
- Updated status labels and classes in admin views (password-resets, unit-routing, users).
- Modified configuration constants to replace 'rejected' with 'disapproved'.
- Implemented normalization function for legacy status values.
- Adjusted documentation to reflect changes in status terminology.
- Refactored models (AdminUser, AuthorityToTravel, LocatorSlip, PassSlip) to use 'disapproved' in methods and queries.
- Altered SQL migrations to update ENUM values and existing records.
- Updated reference forms to reflect new approval terminology.
</commit_message>
<xml_diff>
--- a/reference-forms/doc-forms/Locator-Slip.docx
+++ b/reference-forms/doc-forms/Locator-Slip.docx
@@ -1620,28 +1620,66 @@
             <w:pPr>
               <w:rPr>
                 <w:rFonts w:ascii="Bookman Old Style" w:hAnsi="Bookman Old Style"/>
-                <w:sz w:val="18"/>
-                <w:szCs w:val="18"/>
-              </w:rPr>
-            </w:pPr>
-            <w:r>
-              <w:rPr>
-                <w:rFonts w:ascii="Bookman Old Style" w:hAnsi="Bookman Old Style"/>
-                <w:b/>
-                <w:sz w:val="18"/>
-                <w:szCs w:val="18"/>
-              </w:rPr>
-              <w:t>Approved:</w:t>
-            </w:r>
-            <w:r>
-              <w:rPr>
-                <w:rFonts w:ascii="Bookman Old Style" w:hAnsi="Bookman Old Style"/>
-                <w:b/>
-                <w:sz w:val="18"/>
-                <w:szCs w:val="18"/>
-              </w:rPr>
-              <w:t xml:space="preserve">   </w:t>
-            </w:r>
+                <w:b/>
+                <w:sz w:val="18"/>
+                <w:szCs w:val="18"/>
+              </w:rPr>
+            </w:pPr>
+            <w:r>
+              <w:rPr>
+                <w:rFonts w:ascii="Bookman Old Style" w:hAnsi="Bookman Old Style"/>
+                <w:b/>
+                <w:sz w:val="18"/>
+                <w:szCs w:val="18"/>
+              </w:rPr>
+              <w:t>Electronically Approved:</w:t>
+            </w:r>
+          </w:p>
+          <w:p>
+            <w:pPr>
+              <w:rPr>
+                <w:rFonts w:ascii="Bookman Old Style" w:hAnsi="Bookman Old Style"/>
+                <w:sz w:val="14"/>
+                <w:szCs w:val="14"/>
+              </w:rPr>
+            </w:pPr>
+          </w:p>
+          <w:p>
+            <w:pPr>
+              <w:rPr>
+                <w:rFonts w:ascii="Bookman Old Style" w:hAnsi="Bookman Old Style"/>
+                <w:sz w:val="14"/>
+                <w:szCs w:val="14"/>
+              </w:rPr>
+            </w:pPr>
+          </w:p>
+          <w:p>
+            <w:pPr>
+              <w:rPr>
+                <w:rFonts w:ascii="Bookman Old Style" w:hAnsi="Bookman Old Style"/>
+                <w:sz w:val="14"/>
+                <w:szCs w:val="14"/>
+              </w:rPr>
+            </w:pPr>
+          </w:p>
+          <w:p>
+            <w:pPr>
+              <w:rPr>
+                <w:rFonts w:ascii="Bookman Old Style" w:hAnsi="Bookman Old Style"/>
+                <w:b/>
+                <w:sz w:val="18"/>
+                <w:szCs w:val="18"/>
+              </w:rPr>
+            </w:pPr>
+          </w:p>
+          <w:p>
+            <w:pPr>
+              <w:rPr>
+                <w:rFonts w:ascii="Bookman Old Style" w:hAnsi="Bookman Old Style"/>
+                <w:sz w:val="18"/>
+                <w:szCs w:val="18"/>
+              </w:rPr>
+            </w:pPr>
             <w:r>
               <w:rPr>
                 <w:rFonts w:ascii="Bookman Old Style" w:hAnsi="Bookman Old Style"/>
@@ -1735,16 +1773,7 @@
                 <w:sz w:val="14"/>
                 <w:szCs w:val="14"/>
               </w:rPr>
-              <w:t>$</w:t>
-            </w:r>
-            <w:r>
-              <w:rPr>
-                <w:rFonts w:ascii="Bookman Old Style" w:hAnsi="Bookman Old Style" w:cs="Calibri"/>
-                <w:color w:val="000000"/>
-                <w:sz w:val="14"/>
-                <w:szCs w:val="14"/>
-              </w:rPr>
-              <w:t>{</w:t>
+              <w:t>${</w:t>
             </w:r>
             <w:proofErr w:type="spellStart"/>
             <w:r>
@@ -1767,45 +1796,6 @@
               </w:rPr>
               <w:t>}</w:t>
             </w:r>
-          </w:p>
-          <w:p>
-            <w:pPr>
-              <w:rPr>
-                <w:rFonts w:ascii="Bookman Old Style" w:hAnsi="Bookman Old Style"/>
-                <w:b/>
-                <w:sz w:val="18"/>
-                <w:szCs w:val="18"/>
-              </w:rPr>
-            </w:pPr>
-          </w:p>
-          <w:p>
-            <w:pPr>
-              <w:rPr>
-                <w:rFonts w:ascii="Bookman Old Style" w:hAnsi="Bookman Old Style"/>
-                <w:b/>
-                <w:sz w:val="18"/>
-                <w:szCs w:val="18"/>
-              </w:rPr>
-            </w:pPr>
-          </w:p>
-          <w:p>
-            <w:pPr>
-              <w:rPr>
-                <w:rFonts w:ascii="Bookman Old Style" w:hAnsi="Bookman Old Style"/>
-                <w:b/>
-                <w:sz w:val="18"/>
-                <w:szCs w:val="18"/>
-              </w:rPr>
-            </w:pPr>
-          </w:p>
-          <w:p>
-            <w:pPr>
-              <w:rPr>
-                <w:rFonts w:ascii="Bookman Old Style" w:hAnsi="Bookman Old Style"/>
-                <w:sz w:val="18"/>
-                <w:szCs w:val="18"/>
-              </w:rPr>
-            </w:pPr>
           </w:p>
           <w:p>
             <w:pPr>
@@ -3664,27 +3654,66 @@
             <w:pPr>
               <w:rPr>
                 <w:rFonts w:ascii="Bookman Old Style" w:hAnsi="Bookman Old Style"/>
-                <w:sz w:val="18"/>
-                <w:szCs w:val="18"/>
-              </w:rPr>
-            </w:pPr>
-            <w:r>
-              <w:rPr>
-                <w:rFonts w:ascii="Bookman Old Style" w:hAnsi="Bookman Old Style"/>
-                <w:b/>
-                <w:sz w:val="18"/>
-                <w:szCs w:val="18"/>
-              </w:rPr>
-              <w:t>Approved:</w:t>
-            </w:r>
-            <w:r>
-              <w:rPr>
-                <w:rFonts w:ascii="Bookman Old Style" w:hAnsi="Bookman Old Style"/>
-                <w:sz w:val="18"/>
-                <w:szCs w:val="18"/>
-              </w:rPr>
-              <w:t xml:space="preserve">  </w:t>
-            </w:r>
+                <w:b/>
+                <w:sz w:val="18"/>
+                <w:szCs w:val="18"/>
+              </w:rPr>
+            </w:pPr>
+            <w:r>
+              <w:rPr>
+                <w:rFonts w:ascii="Bookman Old Style" w:hAnsi="Bookman Old Style"/>
+                <w:b/>
+                <w:sz w:val="18"/>
+                <w:szCs w:val="18"/>
+              </w:rPr>
+              <w:t>Electronically Approved:</w:t>
+            </w:r>
+          </w:p>
+          <w:p>
+            <w:pPr>
+              <w:rPr>
+                <w:rFonts w:ascii="Bookman Old Style" w:hAnsi="Bookman Old Style"/>
+                <w:sz w:val="14"/>
+                <w:szCs w:val="14"/>
+              </w:rPr>
+            </w:pPr>
+          </w:p>
+          <w:p>
+            <w:pPr>
+              <w:rPr>
+                <w:rFonts w:ascii="Bookman Old Style" w:hAnsi="Bookman Old Style"/>
+                <w:sz w:val="14"/>
+                <w:szCs w:val="14"/>
+              </w:rPr>
+            </w:pPr>
+          </w:p>
+          <w:p>
+            <w:pPr>
+              <w:rPr>
+                <w:rFonts w:ascii="Bookman Old Style" w:hAnsi="Bookman Old Style"/>
+                <w:sz w:val="14"/>
+                <w:szCs w:val="14"/>
+              </w:rPr>
+            </w:pPr>
+          </w:p>
+          <w:p>
+            <w:pPr>
+              <w:rPr>
+                <w:rFonts w:ascii="Bookman Old Style" w:hAnsi="Bookman Old Style"/>
+                <w:b/>
+                <w:sz w:val="18"/>
+                <w:szCs w:val="18"/>
+              </w:rPr>
+            </w:pPr>
+          </w:p>
+          <w:p>
+            <w:pPr>
+              <w:rPr>
+                <w:rFonts w:ascii="Bookman Old Style" w:hAnsi="Bookman Old Style"/>
+                <w:sz w:val="18"/>
+                <w:szCs w:val="18"/>
+              </w:rPr>
+            </w:pPr>
             <w:r>
               <w:rPr>
                 <w:rFonts w:ascii="Bookman Old Style" w:hAnsi="Bookman Old Style"/>
@@ -3778,16 +3807,7 @@
                 <w:sz w:val="14"/>
                 <w:szCs w:val="14"/>
               </w:rPr>
-              <w:t>$</w:t>
-            </w:r>
-            <w:r>
-              <w:rPr>
-                <w:rFonts w:ascii="Bookman Old Style" w:hAnsi="Bookman Old Style" w:cs="Calibri"/>
-                <w:color w:val="000000"/>
-                <w:sz w:val="14"/>
-                <w:szCs w:val="14"/>
-              </w:rPr>
-              <w:t>{</w:t>
+              <w:t>${</w:t>
             </w:r>
             <w:proofErr w:type="spellStart"/>
             <w:r>
@@ -3810,45 +3830,6 @@
               </w:rPr>
               <w:t>}</w:t>
             </w:r>
-          </w:p>
-          <w:p>
-            <w:pPr>
-              <w:rPr>
-                <w:rFonts w:ascii="Bookman Old Style" w:hAnsi="Bookman Old Style"/>
-                <w:sz w:val="18"/>
-                <w:szCs w:val="18"/>
-              </w:rPr>
-            </w:pPr>
-          </w:p>
-          <w:p>
-            <w:pPr>
-              <w:rPr>
-                <w:rFonts w:ascii="Bookman Old Style" w:hAnsi="Bookman Old Style"/>
-                <w:b/>
-                <w:sz w:val="18"/>
-                <w:szCs w:val="18"/>
-              </w:rPr>
-            </w:pPr>
-          </w:p>
-          <w:p>
-            <w:pPr>
-              <w:rPr>
-                <w:rFonts w:ascii="Bookman Old Style" w:hAnsi="Bookman Old Style"/>
-                <w:b/>
-                <w:sz w:val="18"/>
-                <w:szCs w:val="18"/>
-              </w:rPr>
-            </w:pPr>
-          </w:p>
-          <w:p>
-            <w:pPr>
-              <w:rPr>
-                <w:rFonts w:ascii="Bookman Old Style" w:hAnsi="Bookman Old Style"/>
-                <w:b/>
-                <w:sz w:val="18"/>
-                <w:szCs w:val="18"/>
-              </w:rPr>
-            </w:pPr>
           </w:p>
           <w:p>
             <w:pPr>
@@ -4531,7 +4512,7 @@
   <w:style w:type="paragraph" w:default="1" w:styleId="Normal">
     <w:name w:val="Normal"/>
     <w:qFormat/>
-    <w:rsid w:val="00816BAF"/>
+    <w:rsid w:val="001C3854"/>
   </w:style>
   <w:style w:type="character" w:default="1" w:styleId="DefaultParagraphFont">
     <w:name w:val="Default Paragraph Font"/>

</xml_diff>